<commit_message>
Added Participation and Sources to Report and Added pdf version of Report and PP
</commit_message>
<xml_diff>
--- a/Report/Closest Pair Report.docx
+++ b/Report/Closest Pair Report.docx
@@ -971,11 +971,9 @@
       <w:r>
         <w:t xml:space="preserve">We wrote our algorithms in Python, which each algorithm </w:t>
       </w:r>
-      <w:proofErr w:type="gramStart"/>
       <w:r>
         <w:t>having</w:t>
       </w:r>
-      <w:proofErr w:type="gramEnd"/>
       <w:r>
         <w:t xml:space="preserve"> its own file that is run through a main file. Datasets were artificially generated of XY pairs with a size n, which starts at 2 and increases exponentially up to 8192. Each algorithm is run 5 times within the program for each input size n to get a more accurate result.</w:t>
       </w:r>
@@ -2376,7 +2374,6 @@
       <w:r>
         <w:t>“Closest Pair of Points.” </w:t>
       </w:r>
-      <w:proofErr w:type="spellStart"/>
       <w:r>
         <w:rPr>
           <w:i/>
@@ -2384,7 +2381,6 @@
         </w:rPr>
         <w:t>GeeksforGeeks</w:t>
       </w:r>
-      <w:proofErr w:type="spellEnd"/>
       <w:r>
         <w:t>, 2</w:t>
       </w:r>

</xml_diff>